<commit_message>
fix: add footer on server
Add EngineeringPaper.xyz footer on server instead of client
</commit_message>
<xml_diff>
--- a/tests/output_reference.docx
+++ b/tests/output_reference.docx
@@ -209,7 +209,7 @@
       </m:oMathPara>
     </w:p>
     <w:bookmarkEnd w:id="27"/>
-    <w:bookmarkStart w:id="35" w:name="Xfb335a063a29fa7ff8901568d8337a2f539485f"/>
+    <w:bookmarkStart w:id="36" w:name="Xfb335a063a29fa7ff8901568d8337a2f539485f"/>
     <w:p>
       <w:pPr>
         <w:pStyle w:val="Heading1"/>
@@ -900,7 +900,26 @@
         </m:oMath>
       </m:oMathPara>
     </w:p>
-    <w:bookmarkEnd w:id="35"/>
+    <w:p>
+      <w:pPr>
+        <w:pStyle w:val="FirstParagraph"/>
+      </w:pPr>
+      <w:r>
+        <w:t xml:space="preserve">Created with</w:t>
+      </w:r>
+      <w:r>
+        <w:t xml:space="preserve"> </w:t>
+      </w:r>
+      <w:hyperlink r:id="rId35">
+        <w:r>
+          <w:rPr>
+            <w:rStyle w:val="Hyperlink"/>
+          </w:rPr>
+          <w:t xml:space="preserve">EngineeringPaper.xyz</w:t>
+        </w:r>
+      </w:hyperlink>
+    </w:p>
+    <w:bookmarkEnd w:id="36"/>
     <w:sectPr/>
   </w:body>
 </w:document>

</xml_diff>

<commit_message>
chore: bump pandoc to 3.3.0
</commit_message>
<xml_diff>
--- a/tests/output_reference.docx
+++ b/tests/output_reference.docx
@@ -951,14 +951,14 @@
 <file path=word/numbering.xml><?xml version="1.0" encoding="utf-8"?>
 <w:numbering xmlns:w="http://schemas.openxmlformats.org/wordprocessingml/2006/main">
   <w:abstractNum w:abstractNumId="990">
-    <w:nsid w:val="A990"/>
+    <w:nsid w:val="0000A990"/>
     <w:multiLevelType w:val="multilevel"/>
     <w:lvl w:ilvl="0">
       <w:numFmt w:val="bullet"/>
       <w:lvlText w:val=" "/>
       <w:lvlJc w:val="left"/>
       <w:pPr>
-        <w:ind w:left="720" w:hanging="480"/>
+        <w:ind w:left="720" w:hanging="360"/>
       </w:pPr>
     </w:lvl>
     <w:lvl w:ilvl="1">
@@ -966,7 +966,7 @@
       <w:lvlText w:val=" "/>
       <w:lvlJc w:val="left"/>
       <w:pPr>
-        <w:ind w:left="1440" w:hanging="480"/>
+        <w:ind w:left="1440" w:hanging="360"/>
       </w:pPr>
     </w:lvl>
     <w:lvl w:ilvl="2">
@@ -974,7 +974,7 @@
       <w:lvlText w:val=" "/>
       <w:lvlJc w:val="left"/>
       <w:pPr>
-        <w:ind w:left="2160" w:hanging="480"/>
+        <w:ind w:left="2160" w:hanging="360"/>
       </w:pPr>
     </w:lvl>
     <w:lvl w:ilvl="3">
@@ -982,7 +982,7 @@
       <w:lvlText w:val=" "/>
       <w:lvlJc w:val="left"/>
       <w:pPr>
-        <w:ind w:left="2880" w:hanging="480"/>
+        <w:ind w:left="2880" w:hanging="360"/>
       </w:pPr>
     </w:lvl>
     <w:lvl w:ilvl="4">
@@ -990,7 +990,7 @@
       <w:lvlText w:val=" "/>
       <w:lvlJc w:val="left"/>
       <w:pPr>
-        <w:ind w:left="3600" w:hanging="480"/>
+        <w:ind w:left="3600" w:hanging="360"/>
       </w:pPr>
     </w:lvl>
     <w:lvl w:ilvl="5">
@@ -998,7 +998,7 @@
       <w:lvlText w:val=" "/>
       <w:lvlJc w:val="left"/>
       <w:pPr>
-        <w:ind w:left="4320" w:hanging="480"/>
+        <w:ind w:left="4320" w:hanging="360"/>
       </w:pPr>
     </w:lvl>
     <w:lvl w:ilvl="6">
@@ -1006,7 +1006,7 @@
       <w:lvlText w:val=" "/>
       <w:lvlJc w:val="left"/>
       <w:pPr>
-        <w:ind w:left="5040" w:hanging="480"/>
+        <w:ind w:left="5040" w:hanging="360"/>
       </w:pPr>
     </w:lvl>
     <w:lvl w:ilvl="7">
@@ -1014,7 +1014,7 @@
       <w:lvlText w:val=" "/>
       <w:lvlJc w:val="left"/>
       <w:pPr>
-        <w:ind w:left="5760" w:hanging="480"/>
+        <w:ind w:left="5760" w:hanging="360"/>
       </w:pPr>
     </w:lvl>
     <w:lvl w:ilvl="8">
@@ -1022,7 +1022,7 @@
       <w:lvlText w:val=" "/>
       <w:lvlJc w:val="left"/>
       <w:pPr>
-        <w:ind w:left="6480" w:hanging="480"/>
+        <w:ind w:left="6480" w:hanging="360"/>
       </w:pPr>
     </w:lvl>
   </w:abstractNum>
@@ -1058,10 +1058,10 @@
     <w:name w:val="Body Text"/>
     <w:basedOn w:val="Normal"/>
     <w:link w:val="BodyTextChar"/>
+    <w:qFormat/>
     <w:pPr>
       <w:spacing w:after="180" w:before="180"/>
     </w:pPr>
-    <w:qFormat/>
   </w:style>
   <w:style w:customStyle="1" w:styleId="FirstParagraph" w:type="paragraph">
     <w:name w:val="First Paragraph"/>
@@ -1081,36 +1081,69 @@
     <w:name w:val="Title"/>
     <w:basedOn w:val="Normal"/>
     <w:next w:val="BodyText"/>
-    <w:qFormat/>
-    <w:pPr>
-      <w:keepNext/>
-      <w:keepLines/>
-      <w:spacing w:after="240" w:before="480"/>
+    <w:link w:val="TitleChar"/>
+    <w:uiPriority w:val="10"/>
+    <w:qFormat/>
+    <w:rsid w:val="00A10FD9"/>
+    <w:pPr>
+      <w:spacing w:after="80" w:line="240" w:lineRule="auto"/>
+      <w:contextualSpacing/>
       <w:jc w:val="center"/>
     </w:pPr>
     <w:rPr>
       <w:rFonts w:asciiTheme="majorHAnsi" w:cstheme="majorBidi" w:eastAsiaTheme="majorEastAsia" w:hAnsiTheme="majorHAnsi"/>
-      <w:b/>
-      <w:bCs/>
-      <w:color w:themeColor="accent1" w:themeShade="B5" w:val="345A8A"/>
-      <w:sz w:val="36"/>
-      <w:szCs w:val="36"/>
+      <w:spacing w:val="-10"/>
+      <w:kern w:val="28"/>
+      <w:sz w:val="56"/>
+      <w:szCs w:val="56"/>
+    </w:rPr>
+  </w:style>
+  <w:style w:customStyle="1" w:styleId="TitleChar" w:type="character">
+    <w:name w:val="Title Char"/>
+    <w:basedOn w:val="DefaultParagraphFont"/>
+    <w:link w:val="Title"/>
+    <w:uiPriority w:val="10"/>
+    <w:rsid w:val="00A10FD9"/>
+    <w:rPr>
+      <w:rFonts w:asciiTheme="majorHAnsi" w:cstheme="majorBidi" w:eastAsiaTheme="majorEastAsia" w:hAnsiTheme="majorHAnsi"/>
+      <w:spacing w:val="-10"/>
+      <w:kern w:val="28"/>
+      <w:sz w:val="56"/>
+      <w:szCs w:val="56"/>
     </w:rPr>
   </w:style>
   <w:style w:styleId="Subtitle" w:type="paragraph">
     <w:name w:val="Subtitle"/>
     <w:basedOn w:val="Title"/>
     <w:next w:val="BodyText"/>
-    <w:qFormat/>
-    <w:pPr>
-      <w:keepNext/>
-      <w:keepLines/>
-      <w:spacing w:after="240" w:before="240"/>
-      <w:jc w:val="center"/>
-    </w:pPr>
-    <w:rPr>
-      <w:sz w:val="30"/>
-      <w:szCs w:val="30"/>
+    <w:link w:val="SubtitleChar"/>
+    <w:uiPriority w:val="11"/>
+    <w:qFormat/>
+    <w:rsid w:val="00A10FD9"/>
+    <w:pPr>
+      <w:numPr>
+        <w:ilvl w:val="1"/>
+      </w:numPr>
+    </w:pPr>
+    <w:rPr>
+      <w:rFonts w:cstheme="majorBidi" w:eastAsiaTheme="majorEastAsia"/>
+      <w:spacing w:val="15"/>
+      <w:sz w:val="28"/>
+      <w:szCs w:val="28"/>
+    </w:rPr>
+  </w:style>
+  <w:style w:customStyle="1" w:styleId="SubtitleChar" w:type="character">
+    <w:name w:val="Subtitle Char"/>
+    <w:basedOn w:val="DefaultParagraphFont"/>
+    <w:link w:val="Subtitle"/>
+    <w:uiPriority w:val="11"/>
+    <w:rsid w:val="00A10FD9"/>
+    <w:rPr>
+      <w:rFonts w:cstheme="majorBidi" w:eastAsiaTheme="majorEastAsia"/>
+      <w:color w:themeColor="text1" w:themeTint="A6" w:val="595959"/>
+      <w:spacing w:val="15"/>
+      <w:sz w:val="28"/>
+      <w:szCs w:val="28"/>
     </w:rPr>
   </w:style>
   <w:style w:customStyle="1" w:styleId="Author" w:type="paragraph">
@@ -1132,6 +1165,23 @@
       <w:keepLines/>
       <w:jc w:val="center"/>
     </w:pPr>
+  </w:style>
+  <w:style w:customStyle="1" w:styleId="AbstractTitle" w:type="paragraph">
+    <w:name w:val="Abstract Title"/>
+    <w:basedOn w:val="Normal"/>
+    <w:next w:val="Abstract"/>
+    <w:qFormat/>
+    <w:pPr>
+      <w:keepNext/>
+      <w:keepLines/>
+      <w:spacing w:after="0" w:before="300"/>
+      <w:jc w:val="center"/>
+    </w:pPr>
+    <w:rPr>
+      <w:b/>
+      <w:sz w:val="20"/>
+      <w:szCs w:val="20"/>
+    </w:rPr>
   </w:style>
   <w:style w:customStyle="1" w:styleId="Abstract" w:type="paragraph">
     <w:name w:val="Abstract"/>
@@ -1141,7 +1191,7 @@
     <w:pPr>
       <w:keepNext/>
       <w:keepLines/>
-      <w:spacing w:after="300" w:before="300"/>
+      <w:spacing w:after="300" w:before="100"/>
     </w:pPr>
     <w:rPr>
       <w:sz w:val="20"/>
@@ -1157,191 +1207,321 @@
     <w:rPr/>
   </w:style>
   <w:style w:styleId="Heading1" w:type="paragraph">
-    <w:name w:val="Heading 1"/>
+    <w:name w:val="heading 1"/>
     <w:basedOn w:val="Normal"/>
     <w:next w:val="BodyText"/>
-    <w:uiPriority w:val="9"/>
-    <w:qFormat/>
+    <w:link w:val="Heading1Char"/>
+    <w:uiPriority w:val="9"/>
+    <w:qFormat/>
+    <w:rsid w:val="00A10FD9"/>
     <w:pPr>
       <w:keepNext/>
       <w:keepLines/>
-      <w:spacing w:after="0" w:before="480"/>
+      <w:spacing w:after="80" w:before="360"/>
       <w:outlineLvl w:val="0"/>
     </w:pPr>
     <w:rPr>
       <w:rFonts w:asciiTheme="majorHAnsi" w:cstheme="majorBidi" w:eastAsiaTheme="majorEastAsia" w:hAnsiTheme="majorHAnsi"/>
-      <w:b/>
-      <w:bCs/>
-      <w:color w:themeColor="accent1" w:val="4F81BD"/>
+      <w:color w:themeColor="accent1" w:themeShade="BF" w:val="0F4761"/>
+      <w:sz w:val="40"/>
+      <w:szCs w:val="40"/>
+    </w:rPr>
+  </w:style>
+  <w:style w:styleId="Heading2" w:type="paragraph">
+    <w:name w:val="heading 2"/>
+    <w:basedOn w:val="Normal"/>
+    <w:next w:val="BodyText"/>
+    <w:link w:val="Heading2Char"/>
+    <w:uiPriority w:val="9"/>
+    <w:semiHidden/>
+    <w:unhideWhenUsed/>
+    <w:qFormat/>
+    <w:rsid w:val="00A10FD9"/>
+    <w:pPr>
+      <w:keepNext/>
+      <w:keepLines/>
+      <w:spacing w:after="80" w:before="160"/>
+      <w:outlineLvl w:val="1"/>
+    </w:pPr>
+    <w:rPr>
+      <w:rFonts w:asciiTheme="majorHAnsi" w:cstheme="majorBidi" w:eastAsiaTheme="majorEastAsia" w:hAnsiTheme="majorHAnsi"/>
+      <w:color w:themeColor="accent1" w:themeShade="BF" w:val="0F4761"/>
       <w:sz w:val="32"/>
       <w:szCs w:val="32"/>
     </w:rPr>
   </w:style>
-  <w:style w:styleId="Heading2" w:type="paragraph">
-    <w:name w:val="Heading 2"/>
+  <w:style w:styleId="Heading3" w:type="paragraph">
+    <w:name w:val="heading 3"/>
     <w:basedOn w:val="Normal"/>
     <w:next w:val="BodyText"/>
-    <w:uiPriority w:val="9"/>
+    <w:link w:val="Heading3Char"/>
+    <w:uiPriority w:val="9"/>
+    <w:semiHidden/>
     <w:unhideWhenUsed/>
     <w:qFormat/>
+    <w:rsid w:val="00A10FD9"/>
     <w:pPr>
       <w:keepNext/>
       <w:keepLines/>
-      <w:spacing w:after="0" w:before="200"/>
-      <w:outlineLvl w:val="1"/>
-    </w:pPr>
-    <w:rPr>
-      <w:rFonts w:asciiTheme="majorHAnsi" w:cstheme="majorBidi" w:eastAsiaTheme="majorEastAsia" w:hAnsiTheme="majorHAnsi"/>
-      <w:b/>
-      <w:bCs/>
-      <w:color w:themeColor="accent1" w:val="4F81BD"/>
+      <w:spacing w:after="80" w:before="160"/>
+      <w:outlineLvl w:val="2"/>
+    </w:pPr>
+    <w:rPr>
+      <w:rFonts w:cstheme="majorBidi" w:eastAsiaTheme="majorEastAsia"/>
+      <w:color w:themeColor="accent1" w:themeShade="BF" w:val="0F4761"/>
       <w:sz w:val="28"/>
       <w:szCs w:val="28"/>
     </w:rPr>
   </w:style>
-  <w:style w:styleId="Heading3" w:type="paragraph">
-    <w:name w:val="Heading 3"/>
+  <w:style w:styleId="Heading4" w:type="paragraph">
+    <w:name w:val="heading 4"/>
     <w:basedOn w:val="Normal"/>
     <w:next w:val="BodyText"/>
-    <w:uiPriority w:val="9"/>
+    <w:link w:val="Heading4Char"/>
+    <w:uiPriority w:val="9"/>
+    <w:semiHidden/>
     <w:unhideWhenUsed/>
     <w:qFormat/>
+    <w:rsid w:val="00A10FD9"/>
     <w:pPr>
       <w:keepNext/>
       <w:keepLines/>
-      <w:spacing w:after="0" w:before="200"/>
-      <w:outlineLvl w:val="2"/>
-    </w:pPr>
-    <w:rPr>
-      <w:rFonts w:asciiTheme="majorHAnsi" w:cstheme="majorBidi" w:eastAsiaTheme="majorEastAsia" w:hAnsiTheme="majorHAnsi"/>
-      <w:b/>
-      <w:bCs/>
-      <w:color w:themeColor="accent1" w:val="4F81BD"/>
-      <w:sz w:val="24"/>
-      <w:szCs w:val="24"/>
-    </w:rPr>
-  </w:style>
-  <w:style w:styleId="Heading4" w:type="paragraph">
-    <w:name w:val="Heading 4"/>
+      <w:spacing w:after="40" w:before="80"/>
+      <w:outlineLvl w:val="3"/>
+    </w:pPr>
+    <w:rPr>
+      <w:rFonts w:cstheme="majorBidi" w:eastAsiaTheme="majorEastAsia"/>
+      <w:i/>
+      <w:iCs/>
+      <w:color w:themeColor="accent1" w:themeShade="BF" w:val="0F4761"/>
+    </w:rPr>
+  </w:style>
+  <w:style w:styleId="Heading5" w:type="paragraph">
+    <w:name w:val="heading 5"/>
     <w:basedOn w:val="Normal"/>
     <w:next w:val="BodyText"/>
-    <w:uiPriority w:val="9"/>
+    <w:link w:val="Heading5Char"/>
+    <w:uiPriority w:val="9"/>
+    <w:semiHidden/>
     <w:unhideWhenUsed/>
     <w:qFormat/>
+    <w:rsid w:val="00A10FD9"/>
     <w:pPr>
       <w:keepNext/>
       <w:keepLines/>
-      <w:spacing w:after="0" w:before="200"/>
-      <w:outlineLvl w:val="3"/>
-    </w:pPr>
-    <w:rPr>
-      <w:rFonts w:asciiTheme="majorHAnsi" w:cstheme="majorBidi" w:eastAsiaTheme="majorEastAsia" w:hAnsiTheme="majorHAnsi"/>
-      <w:i/>
-      <w:bCs/>
-      <w:color w:themeColor="accent1" w:val="4F81BD"/>
-      <w:sz w:val="24"/>
-      <w:szCs w:val="24"/>
-    </w:rPr>
-  </w:style>
-  <w:style w:styleId="Heading5" w:type="paragraph">
-    <w:name w:val="Heading 5"/>
+      <w:spacing w:after="40" w:before="80"/>
+      <w:outlineLvl w:val="4"/>
+    </w:pPr>
+    <w:rPr>
+      <w:rFonts w:cstheme="majorBidi" w:eastAsiaTheme="majorEastAsia"/>
+      <w:color w:themeColor="accent1" w:themeShade="BF" w:val="0F4761"/>
+    </w:rPr>
+  </w:style>
+  <w:style w:styleId="Heading6" w:type="paragraph">
+    <w:name w:val="heading 6"/>
     <w:basedOn w:val="Normal"/>
     <w:next w:val="BodyText"/>
-    <w:uiPriority w:val="9"/>
+    <w:link w:val="Heading6Char"/>
+    <w:uiPriority w:val="9"/>
+    <w:semiHidden/>
     <w:unhideWhenUsed/>
     <w:qFormat/>
+    <w:rsid w:val="00A10FD9"/>
     <w:pPr>
       <w:keepNext/>
       <w:keepLines/>
-      <w:spacing w:after="0" w:before="200"/>
-      <w:outlineLvl w:val="4"/>
-    </w:pPr>
-    <w:rPr>
-      <w:rFonts w:asciiTheme="majorHAnsi" w:cstheme="majorBidi" w:eastAsiaTheme="majorEastAsia" w:hAnsiTheme="majorHAnsi"/>
+      <w:spacing w:after="0" w:before="40"/>
+      <w:outlineLvl w:val="5"/>
+    </w:pPr>
+    <w:rPr>
+      <w:rFonts w:cstheme="majorBidi" w:eastAsiaTheme="majorEastAsia"/>
+      <w:i/>
       <w:iCs/>
-      <w:color w:themeColor="accent1" w:val="4F81BD"/>
-      <w:sz w:val="24"/>
-      <w:szCs w:val="24"/>
-    </w:rPr>
-  </w:style>
-  <w:style w:styleId="Heading6" w:type="paragraph">
-    <w:name w:val="Heading 6"/>
+      <w:color w:themeColor="text1" w:themeTint="A6" w:val="595959"/>
+    </w:rPr>
+  </w:style>
+  <w:style w:styleId="Heading7" w:type="paragraph">
+    <w:name w:val="heading 7"/>
     <w:basedOn w:val="Normal"/>
     <w:next w:val="BodyText"/>
-    <w:uiPriority w:val="9"/>
+    <w:link w:val="Heading7Char"/>
+    <w:uiPriority w:val="9"/>
+    <w:semiHidden/>
     <w:unhideWhenUsed/>
     <w:qFormat/>
+    <w:rsid w:val="00A10FD9"/>
     <w:pPr>
       <w:keepNext/>
       <w:keepLines/>
-      <w:spacing w:after="0" w:before="200"/>
-      <w:outlineLvl w:val="5"/>
-    </w:pPr>
-    <w:rPr>
-      <w:rFonts w:asciiTheme="majorHAnsi" w:cstheme="majorBidi" w:eastAsiaTheme="majorEastAsia" w:hAnsiTheme="majorHAnsi"/>
-      <w:color w:themeColor="accent1" w:val="4F81BD"/>
-      <w:sz w:val="24"/>
-      <w:szCs w:val="24"/>
-    </w:rPr>
-  </w:style>
-  <w:style w:styleId="Heading7" w:type="paragraph">
-    <w:name w:val="Heading 7"/>
+      <w:spacing w:after="0" w:before="40"/>
+      <w:outlineLvl w:val="6"/>
+    </w:pPr>
+    <w:rPr>
+      <w:rFonts w:cstheme="majorBidi" w:eastAsiaTheme="majorEastAsia"/>
+      <w:color w:themeColor="text1" w:themeTint="A6" w:val="595959"/>
+    </w:rPr>
+  </w:style>
+  <w:style w:styleId="Heading8" w:type="paragraph">
+    <w:name w:val="heading 8"/>
     <w:basedOn w:val="Normal"/>
     <w:next w:val="BodyText"/>
-    <w:uiPriority w:val="9"/>
+    <w:link w:val="Heading8Char"/>
+    <w:uiPriority w:val="9"/>
+    <w:semiHidden/>
     <w:unhideWhenUsed/>
     <w:qFormat/>
+    <w:rsid w:val="00A10FD9"/>
     <w:pPr>
       <w:keepNext/>
       <w:keepLines/>
-      <w:spacing w:after="0" w:before="200"/>
-      <w:outlineLvl w:val="6"/>
-    </w:pPr>
-    <w:rPr>
-      <w:rFonts w:asciiTheme="majorHAnsi" w:cstheme="majorBidi" w:eastAsiaTheme="majorEastAsia" w:hAnsiTheme="majorHAnsi"/>
-      <w:color w:themeColor="accent1" w:val="4F81BD"/>
-      <w:sz w:val="24"/>
-      <w:szCs w:val="24"/>
-    </w:rPr>
-  </w:style>
-  <w:style w:styleId="Heading8" w:type="paragraph">
-    <w:name w:val="Heading 8"/>
+      <w:spacing w:after="0"/>
+      <w:outlineLvl w:val="7"/>
+    </w:pPr>
+    <w:rPr>
+      <w:rFonts w:cstheme="majorBidi" w:eastAsiaTheme="majorEastAsia"/>
+      <w:i/>
+      <w:iCs/>
+      <w:color w:themeColor="text1" w:themeTint="D8" w:val="272727"/>
+    </w:rPr>
+  </w:style>
+  <w:style w:styleId="Heading9" w:type="paragraph">
+    <w:name w:val="heading 9"/>
     <w:basedOn w:val="Normal"/>
     <w:next w:val="BodyText"/>
-    <w:uiPriority w:val="9"/>
+    <w:link w:val="Heading9Char"/>
+    <w:uiPriority w:val="9"/>
+    <w:semiHidden/>
     <w:unhideWhenUsed/>
     <w:qFormat/>
+    <w:rsid w:val="00A10FD9"/>
     <w:pPr>
       <w:keepNext/>
       <w:keepLines/>
-      <w:spacing w:after="0" w:before="200"/>
-      <w:outlineLvl w:val="7"/>
-    </w:pPr>
+      <w:spacing w:after="0"/>
+      <w:outlineLvl w:val="8"/>
+    </w:pPr>
+    <w:rPr>
+      <w:rFonts w:cstheme="majorBidi" w:eastAsiaTheme="majorEastAsia"/>
+      <w:color w:themeColor="text1" w:themeTint="D8" w:val="272727"/>
+    </w:rPr>
+  </w:style>
+  <w:style w:customStyle="1" w:styleId="Heading1Char" w:type="character">
+    <w:name w:val="Heading 1 Char"/>
+    <w:basedOn w:val="DefaultParagraphFont"/>
+    <w:link w:val="Heading1"/>
+    <w:uiPriority w:val="9"/>
+    <w:rsid w:val="00A10FD9"/>
     <w:rPr>
       <w:rFonts w:asciiTheme="majorHAnsi" w:cstheme="majorBidi" w:eastAsiaTheme="majorEastAsia" w:hAnsiTheme="majorHAnsi"/>
-      <w:color w:themeColor="accent1" w:val="4F81BD"/>
-      <w:sz w:val="24"/>
-      <w:szCs w:val="24"/>
-    </w:rPr>
-  </w:style>
-  <w:style w:styleId="Heading9" w:type="paragraph">
-    <w:name w:val="Heading 9"/>
-    <w:basedOn w:val="Normal"/>
-    <w:next w:val="BodyText"/>
-    <w:uiPriority w:val="9"/>
-    <w:unhideWhenUsed/>
-    <w:qFormat/>
-    <w:pPr>
-      <w:keepNext/>
-      <w:keepLines/>
-      <w:spacing w:after="0" w:before="200"/>
-      <w:outlineLvl w:val="8"/>
-    </w:pPr>
+      <w:color w:themeColor="accent1" w:themeShade="BF" w:val="0F4761"/>
+      <w:sz w:val="40"/>
+      <w:szCs w:val="40"/>
+    </w:rPr>
+  </w:style>
+  <w:style w:customStyle="1" w:styleId="Heading2Char" w:type="character">
+    <w:name w:val="Heading 2 Char"/>
+    <w:basedOn w:val="DefaultParagraphFont"/>
+    <w:link w:val="Heading2"/>
+    <w:uiPriority w:val="9"/>
+    <w:semiHidden/>
+    <w:rsid w:val="00A10FD9"/>
     <w:rPr>
       <w:rFonts w:asciiTheme="majorHAnsi" w:cstheme="majorBidi" w:eastAsiaTheme="majorEastAsia" w:hAnsiTheme="majorHAnsi"/>
-      <w:color w:themeColor="accent1" w:val="4F81BD"/>
-      <w:sz w:val="24"/>
-      <w:szCs w:val="24"/>
+      <w:color w:themeColor="accent1" w:themeShade="BF" w:val="0F4761"/>
+      <w:sz w:val="32"/>
+      <w:szCs w:val="32"/>
+    </w:rPr>
+  </w:style>
+  <w:style w:customStyle="1" w:styleId="Heading3Char" w:type="character">
+    <w:name w:val="Heading 3 Char"/>
+    <w:basedOn w:val="DefaultParagraphFont"/>
+    <w:link w:val="Heading3"/>
+    <w:uiPriority w:val="9"/>
+    <w:semiHidden/>
+    <w:rsid w:val="00A10FD9"/>
+    <w:rPr>
+      <w:rFonts w:cstheme="majorBidi" w:eastAsiaTheme="majorEastAsia"/>
+      <w:color w:themeColor="accent1" w:themeShade="BF" w:val="0F4761"/>
+      <w:sz w:val="28"/>
+      <w:szCs w:val="28"/>
+    </w:rPr>
+  </w:style>
+  <w:style w:customStyle="1" w:styleId="Heading4Char" w:type="character">
+    <w:name w:val="Heading 4 Char"/>
+    <w:basedOn w:val="DefaultParagraphFont"/>
+    <w:link w:val="Heading4"/>
+    <w:uiPriority w:val="9"/>
+    <w:semiHidden/>
+    <w:rsid w:val="00A10FD9"/>
+    <w:rPr>
+      <w:rFonts w:cstheme="majorBidi" w:eastAsiaTheme="majorEastAsia"/>
+      <w:i/>
+      <w:iCs/>
+      <w:color w:themeColor="accent1" w:themeShade="BF" w:val="0F4761"/>
+    </w:rPr>
+  </w:style>
+  <w:style w:customStyle="1" w:styleId="Heading5Char" w:type="character">
+    <w:name w:val="Heading 5 Char"/>
+    <w:basedOn w:val="DefaultParagraphFont"/>
+    <w:link w:val="Heading5"/>
+    <w:uiPriority w:val="9"/>
+    <w:semiHidden/>
+    <w:rsid w:val="00A10FD9"/>
+    <w:rPr>
+      <w:rFonts w:cstheme="majorBidi" w:eastAsiaTheme="majorEastAsia"/>
+      <w:color w:themeColor="accent1" w:themeShade="BF" w:val="0F4761"/>
+    </w:rPr>
+  </w:style>
+  <w:style w:customStyle="1" w:styleId="Heading6Char" w:type="character">
+    <w:name w:val="Heading 6 Char"/>
+    <w:basedOn w:val="DefaultParagraphFont"/>
+    <w:link w:val="Heading6"/>
+    <w:uiPriority w:val="9"/>
+    <w:semiHidden/>
+    <w:rsid w:val="00A10FD9"/>
+    <w:rPr>
+      <w:rFonts w:cstheme="majorBidi" w:eastAsiaTheme="majorEastAsia"/>
+      <w:i/>
+      <w:iCs/>
+      <w:color w:themeColor="text1" w:themeTint="A6" w:val="595959"/>
+    </w:rPr>
+  </w:style>
+  <w:style w:customStyle="1" w:styleId="Heading7Char" w:type="character">
+    <w:name w:val="Heading 7 Char"/>
+    <w:basedOn w:val="DefaultParagraphFont"/>
+    <w:link w:val="Heading7"/>
+    <w:uiPriority w:val="9"/>
+    <w:semiHidden/>
+    <w:rsid w:val="00A10FD9"/>
+    <w:rPr>
+      <w:rFonts w:cstheme="majorBidi" w:eastAsiaTheme="majorEastAsia"/>
+      <w:color w:themeColor="text1" w:themeTint="A6" w:val="595959"/>
+    </w:rPr>
+  </w:style>
+  <w:style w:customStyle="1" w:styleId="Heading8Char" w:type="character">
+    <w:name w:val="Heading 8 Char"/>
+    <w:basedOn w:val="DefaultParagraphFont"/>
+    <w:link w:val="Heading8"/>
+    <w:uiPriority w:val="9"/>
+    <w:semiHidden/>
+    <w:rsid w:val="00A10FD9"/>
+    <w:rPr>
+      <w:rFonts w:cstheme="majorBidi" w:eastAsiaTheme="majorEastAsia"/>
+      <w:i/>
+      <w:iCs/>
+      <w:color w:themeColor="text1" w:themeTint="D8" w:val="272727"/>
+    </w:rPr>
+  </w:style>
+  <w:style w:customStyle="1" w:styleId="Heading9Char" w:type="character">
+    <w:name w:val="Heading 9 Char"/>
+    <w:basedOn w:val="DefaultParagraphFont"/>
+    <w:link w:val="Heading9"/>
+    <w:uiPriority w:val="9"/>
+    <w:semiHidden/>
+    <w:rsid w:val="00A10FD9"/>
+    <w:rPr>
+      <w:rFonts w:cstheme="majorBidi" w:eastAsiaTheme="majorEastAsia"/>
+      <w:color w:themeColor="text1" w:themeTint="D8" w:val="272727"/>
     </w:rPr>
   </w:style>
   <w:style w:styleId="BlockText" w:type="paragraph">
@@ -1363,6 +1543,18 @@
     <w:uiPriority w:val="9"/>
     <w:unhideWhenUsed/>
     <w:qFormat/>
+  </w:style>
+  <w:style w:styleId="FootnoteBlockText" w:type="paragraph">
+    <w:name w:val="Footnote Block Text"/>
+    <w:basedOn w:val="FootnoteText"/>
+    <w:next w:val="FootnoteText"/>
+    <w:uiPriority w:val="9"/>
+    <w:unhideWhenUsed/>
+    <w:qFormat/>
+    <w:pPr>
+      <w:spacing w:after="100" w:before="100"/>
+      <w:ind w:firstLine="0" w:left="480" w:right="480"/>
+    </w:pPr>
   </w:style>
   <w:style w:default="1" w:styleId="DefaultParagraphFont" w:type="character">
     <w:name w:val="Default Paragraph Font"/>
@@ -1393,10 +1585,10 @@
         <w:jc w:val="left"/>
       </w:trPr>
       <w:tcPr>
-        <w:vAlign w:val="bottom"/>
         <w:tcBorders>
           <w:bottom w:val="single"/>
         </w:tcBorders>
+        <w:vAlign w:val="bottom"/>
       </w:tcPr>
     </w:tblStylePr>
   </w:style>
@@ -1513,44 +1705,44 @@
         <a:sysClr val="window" lastClr="FFFFFF"/>
       </a:lt1>
       <a:dk2>
-        <a:srgbClr val="1F497D"/>
+        <a:srgbClr val="0E2841"/>
       </a:dk2>
       <a:lt2>
-        <a:srgbClr val="EEECE1"/>
+        <a:srgbClr val="E8E8E8"/>
       </a:lt2>
       <a:accent1>
-        <a:srgbClr val="4F81BD"/>
+        <a:srgbClr val="156082"/>
       </a:accent1>
       <a:accent2>
-        <a:srgbClr val="C0504D"/>
+        <a:srgbClr val="E97132"/>
       </a:accent2>
       <a:accent3>
-        <a:srgbClr val="9BBB59"/>
+        <a:srgbClr val="196B24"/>
       </a:accent3>
       <a:accent4>
-        <a:srgbClr val="8064A2"/>
+        <a:srgbClr val="0F9ED5"/>
       </a:accent4>
       <a:accent5>
-        <a:srgbClr val="4BACC6"/>
+        <a:srgbClr val="A02B93"/>
       </a:accent5>
       <a:accent6>
-        <a:srgbClr val="F79646"/>
+        <a:srgbClr val="4EA72E"/>
       </a:accent6>
       <a:hlink>
-        <a:srgbClr val="0000FF"/>
+        <a:srgbClr val="467886"/>
       </a:hlink>
       <a:folHlink>
-        <a:srgbClr val="800080"/>
+        <a:srgbClr val="96607D"/>
       </a:folHlink>
     </a:clrScheme>
     <a:fontScheme name="Office">
       <a:majorFont>
-        <a:latin typeface="Calibri"/>
+        <a:latin typeface="Aptos Display" panose="02110004020202020204"/>
         <a:ea typeface=""/>
         <a:cs typeface=""/>
-        <a:font script="Jpan" typeface="ＭＳ ゴシック"/>
+        <a:font script="Jpan" typeface="游ゴシック Light"/>
         <a:font script="Hang" typeface="맑은 고딕"/>
-        <a:font script="Hans" typeface="宋体"/>
+        <a:font script="Hans" typeface="等线 Light"/>
         <a:font script="Hant" typeface="新細明體"/>
         <a:font script="Arab" typeface="Times New Roman"/>
         <a:font script="Hebr" typeface="Times New Roman"/>
@@ -1577,14 +1769,32 @@
         <a:font script="Mong" typeface="Mongolian Baiti"/>
         <a:font script="Viet" typeface="Times New Roman"/>
         <a:font script="Uigh" typeface="Microsoft Uighur"/>
+        <a:font script="Geor" typeface="Sylfaen"/>
+        <a:font script="Armn" typeface="Arial"/>
+        <a:font script="Bugi" typeface="Leelawadee UI"/>
+        <a:font script="Bopo" typeface="Microsoft JhengHei"/>
+        <a:font script="Java" typeface="Javanese Text"/>
+        <a:font script="Lisu" typeface="Segoe UI"/>
+        <a:font script="Mymr" typeface="Myanmar Text"/>
+        <a:font script="Nkoo" typeface="Ebrima"/>
+        <a:font script="Olck" typeface="Nirmala UI"/>
+        <a:font script="Osma" typeface="Ebrima"/>
+        <a:font script="Phag" typeface="Phagspa"/>
+        <a:font script="Syrn" typeface="Estrangelo Edessa"/>
+        <a:font script="Syrj" typeface="Estrangelo Edessa"/>
+        <a:font script="Syre" typeface="Estrangelo Edessa"/>
+        <a:font script="Sora" typeface="Nirmala UI"/>
+        <a:font script="Tale" typeface="Microsoft Tai Le"/>
+        <a:font script="Talu" typeface="Microsoft New Tai Lue"/>
+        <a:font script="Tfng" typeface="Ebrima"/>
       </a:majorFont>
       <a:minorFont>
-        <a:latin typeface="Cambria"/>
+        <a:latin typeface="Aptos" panose="02110004020202020204"/>
         <a:ea typeface=""/>
         <a:cs typeface=""/>
-        <a:font script="Jpan" typeface="ＭＳ 明朝"/>
+        <a:font script="Jpan" typeface="游明朝"/>
         <a:font script="Hang" typeface="맑은 고딕"/>
-        <a:font script="Hans" typeface="宋体"/>
+        <a:font script="Hans" typeface="等线"/>
         <a:font script="Hant" typeface="新細明體"/>
         <a:font script="Arab" typeface="Arial"/>
         <a:font script="Hebr" typeface="Arial"/>
@@ -1611,6 +1821,24 @@
         <a:font script="Mong" typeface="Mongolian Baiti"/>
         <a:font script="Viet" typeface="Arial"/>
         <a:font script="Uigh" typeface="Microsoft Uighur"/>
+        <a:font script="Geor" typeface="Sylfaen"/>
+        <a:font script="Armn" typeface="Arial"/>
+        <a:font script="Bugi" typeface="Leelawadee UI"/>
+        <a:font script="Bopo" typeface="Microsoft JhengHei"/>
+        <a:font script="Java" typeface="Javanese Text"/>
+        <a:font script="Lisu" typeface="Segoe UI"/>
+        <a:font script="Mymr" typeface="Myanmar Text"/>
+        <a:font script="Nkoo" typeface="Ebrima"/>
+        <a:font script="Olck" typeface="Nirmala UI"/>
+        <a:font script="Osma" typeface="Ebrima"/>
+        <a:font script="Phag" typeface="Phagspa"/>
+        <a:font script="Syrn" typeface="Estrangelo Edessa"/>
+        <a:font script="Syrj" typeface="Estrangelo Edessa"/>
+        <a:font script="Syre" typeface="Estrangelo Edessa"/>
+        <a:font script="Sora" typeface="Nirmala UI"/>
+        <a:font script="Tale" typeface="Microsoft Tai Le"/>
+        <a:font script="Talu" typeface="Microsoft New Tai Lue"/>
+        <a:font script="Tfng" typeface="Ebrima"/>
       </a:minorFont>
     </a:fontScheme>
     <a:fmtScheme name="Office">
@@ -1622,200 +1850,141 @@
           <a:gsLst>
             <a:gs pos="0">
               <a:schemeClr val="phClr">
-                <a:tint val="50000"/>
-                <a:satMod val="300000"/>
+                <a:lumMod val="110000"/>
+                <a:satMod val="105000"/>
+                <a:tint val="67000"/>
               </a:schemeClr>
             </a:gs>
-            <a:gs pos="35000">
+            <a:gs pos="50000">
               <a:schemeClr val="phClr">
-                <a:tint val="37000"/>
-                <a:satMod val="300000"/>
+                <a:lumMod val="105000"/>
+                <a:satMod val="103000"/>
+                <a:tint val="73000"/>
               </a:schemeClr>
             </a:gs>
             <a:gs pos="100000">
               <a:schemeClr val="phClr">
-                <a:tint val="15000"/>
-                <a:satMod val="350000"/>
+                <a:lumMod val="105000"/>
+                <a:satMod val="109000"/>
+                <a:tint val="81000"/>
               </a:schemeClr>
             </a:gs>
           </a:gsLst>
-          <a:lin ang="16200000" scaled="1"/>
+          <a:lin ang="5400000" scaled="0"/>
         </a:gradFill>
         <a:gradFill rotWithShape="1">
           <a:gsLst>
             <a:gs pos="0">
               <a:schemeClr val="phClr">
-                <a:tint val="100000"/>
+                <a:satMod val="103000"/>
+                <a:lumMod val="102000"/>
+                <a:tint val="94000"/>
+              </a:schemeClr>
+            </a:gs>
+            <a:gs pos="50000">
+              <a:schemeClr val="phClr">
+                <a:satMod val="110000"/>
+                <a:lumMod val="100000"/>
                 <a:shade val="100000"/>
-                <a:satMod val="130000"/>
               </a:schemeClr>
             </a:gs>
             <a:gs pos="100000">
               <a:schemeClr val="phClr">
-                <a:tint val="50000"/>
-                <a:shade val="100000"/>
-                <a:satMod val="350000"/>
+                <a:lumMod val="99000"/>
+                <a:satMod val="120000"/>
+                <a:shade val="78000"/>
               </a:schemeClr>
             </a:gs>
           </a:gsLst>
-          <a:lin ang="16200000" scaled="0"/>
+          <a:lin ang="5400000" scaled="0"/>
         </a:gradFill>
       </a:fillStyleLst>
       <a:lnStyleLst>
-        <a:ln w="9525" cap="flat" cmpd="sng" algn="ctr">
-          <a:solidFill>
-            <a:schemeClr val="phClr">
-              <a:shade val="95000"/>
-              <a:satMod val="105000"/>
-            </a:schemeClr>
-          </a:solidFill>
-          <a:prstDash val="solid"/>
-        </a:ln>
-        <a:ln w="25400" cap="flat" cmpd="sng" algn="ctr">
+        <a:ln w="6350" cap="flat" cmpd="sng" algn="ctr">
           <a:solidFill>
             <a:schemeClr val="phClr"/>
           </a:solidFill>
           <a:prstDash val="solid"/>
+          <a:miter lim="800000"/>
         </a:ln>
-        <a:ln w="38100" cap="flat" cmpd="sng" algn="ctr">
+        <a:ln w="12700" cap="flat" cmpd="sng" algn="ctr">
           <a:solidFill>
             <a:schemeClr val="phClr"/>
           </a:solidFill>
           <a:prstDash val="solid"/>
+          <a:miter lim="800000"/>
+        </a:ln>
+        <a:ln w="19050" cap="flat" cmpd="sng" algn="ctr">
+          <a:solidFill>
+            <a:schemeClr val="phClr"/>
+          </a:solidFill>
+          <a:prstDash val="solid"/>
+          <a:miter lim="800000"/>
         </a:ln>
       </a:lnStyleLst>
       <a:effectStyleLst>
         <a:effectStyle>
+          <a:effectLst/>
+        </a:effectStyle>
+        <a:effectStyle>
+          <a:effectLst/>
+        </a:effectStyle>
+        <a:effectStyle>
           <a:effectLst>
-            <a:outerShdw blurRad="40000" dist="20000" dir="5400000" rotWithShape="0">
+            <a:outerShdw blurRad="57150" dist="19050" dir="5400000" algn="ctr" rotWithShape="0">
               <a:srgbClr val="000000">
-                <a:alpha val="38000"/>
+                <a:alpha val="63000"/>
               </a:srgbClr>
             </a:outerShdw>
           </a:effectLst>
-        </a:effectStyle>
-        <a:effectStyle>
-          <a:effectLst>
-            <a:outerShdw blurRad="40000" dist="23000" dir="5400000" rotWithShape="0">
-              <a:srgbClr val="000000">
-                <a:alpha val="35000"/>
-              </a:srgbClr>
-            </a:outerShdw>
-          </a:effectLst>
-        </a:effectStyle>
-        <a:effectStyle>
-          <a:effectLst>
-            <a:outerShdw blurRad="40000" dist="23000" dir="5400000" rotWithShape="0">
-              <a:srgbClr val="000000">
-                <a:alpha val="35000"/>
-              </a:srgbClr>
-            </a:outerShdw>
-          </a:effectLst>
-          <a:scene3d>
-            <a:camera prst="orthographicFront">
-              <a:rot lat="0" lon="0" rev="0"/>
-            </a:camera>
-            <a:lightRig rig="threePt" dir="t">
-              <a:rot lat="0" lon="0" rev="1200000"/>
-            </a:lightRig>
-          </a:scene3d>
-          <a:sp3d>
-            <a:bevelT w="63500" h="25400"/>
-          </a:sp3d>
         </a:effectStyle>
       </a:effectStyleLst>
       <a:bgFillStyleLst>
         <a:solidFill>
           <a:schemeClr val="phClr"/>
         </a:solidFill>
+        <a:solidFill>
+          <a:schemeClr val="phClr">
+            <a:tint val="95000"/>
+            <a:satMod val="170000"/>
+          </a:schemeClr>
+        </a:solidFill>
         <a:gradFill rotWithShape="1">
           <a:gsLst>
             <a:gs pos="0">
               <a:schemeClr val="phClr">
-                <a:tint val="40000"/>
-                <a:satMod val="350000"/>
+                <a:tint val="93000"/>
+                <a:satMod val="150000"/>
+                <a:shade val="98000"/>
+                <a:lumMod val="102000"/>
               </a:schemeClr>
             </a:gs>
-            <a:gs pos="40000">
+            <a:gs pos="50000">
               <a:schemeClr val="phClr">
-                <a:tint val="45000"/>
-                <a:shade val="99000"/>
-                <a:satMod val="350000"/>
+                <a:tint val="98000"/>
+                <a:satMod val="130000"/>
+                <a:shade val="90000"/>
+                <a:lumMod val="103000"/>
               </a:schemeClr>
             </a:gs>
             <a:gs pos="100000">
               <a:schemeClr val="phClr">
-                <a:shade val="20000"/>
-                <a:satMod val="255000"/>
+                <a:shade val="63000"/>
+                <a:satMod val="120000"/>
               </a:schemeClr>
             </a:gs>
           </a:gsLst>
-          <a:path path="circle">
-            <a:fillToRect l="50000" t="-80000" r="50000" b="180000"/>
-          </a:path>
-        </a:gradFill>
-        <a:gradFill rotWithShape="1">
-          <a:gsLst>
-            <a:gs pos="0">
-              <a:schemeClr val="phClr">
-                <a:tint val="80000"/>
-                <a:satMod val="300000"/>
-              </a:schemeClr>
-            </a:gs>
-            <a:gs pos="100000">
-              <a:schemeClr val="phClr">
-                <a:shade val="30000"/>
-                <a:satMod val="200000"/>
-              </a:schemeClr>
-            </a:gs>
-          </a:gsLst>
-          <a:path path="circle">
-            <a:fillToRect l="50000" t="50000" r="50000" b="50000"/>
-          </a:path>
+          <a:lin ang="5400000" scaled="0"/>
         </a:gradFill>
       </a:bgFillStyleLst>
     </a:fmtScheme>
   </a:themeElements>
-  <a:objectDefaults>
-    <a:spDef>
-      <a:spPr/>
-      <a:bodyPr/>
-      <a:lstStyle/>
-      <a:style>
-        <a:lnRef idx="1">
-          <a:schemeClr val="accent1"/>
-        </a:lnRef>
-        <a:fillRef idx="3">
-          <a:schemeClr val="accent1"/>
-        </a:fillRef>
-        <a:effectRef idx="2">
-          <a:schemeClr val="accent1"/>
-        </a:effectRef>
-        <a:fontRef idx="minor">
-          <a:schemeClr val="lt1"/>
-        </a:fontRef>
-      </a:style>
-    </a:spDef>
-    <a:lnDef>
-      <a:spPr/>
-      <a:bodyPr/>
-      <a:lstStyle/>
-      <a:style>
-        <a:lnRef idx="2">
-          <a:schemeClr val="accent1"/>
-        </a:lnRef>
-        <a:fillRef idx="0">
-          <a:schemeClr val="accent1"/>
-        </a:fillRef>
-        <a:effectRef idx="1">
-          <a:schemeClr val="accent1"/>
-        </a:effectRef>
-        <a:fontRef idx="minor">
-          <a:schemeClr val="tx1"/>
-        </a:fontRef>
-      </a:style>
-    </a:lnDef>
-  </a:objectDefaults>
+  <a:objectDefaults/>
   <a:extraClrSchemeLst/>
+  <a:extLst>
+    <a:ext uri="{05A4C25C-085E-4340-85A3-A5531E510DB2}">
+      <thm15:themeFamily xmlns:thm15="http://schemas.microsoft.com/office/thememl/2012/main" name="Office Theme" id="{2E142A2C-CD16-42D6-873A-C26D2A0506FA}" vid="{1BDDFF52-6CD6-40A5-AB3C-68EB2F1E4D0A}"/>
+    </a:ext>
+  </a:extLst>
 </a:theme>
 </file>
</xml_diff>

<commit_message>
feat: change pdf engine to typst
Has the benefits of much faster performance and better handling of unicode characters
</commit_message>
<xml_diff>
--- a/tests/output_reference.docx
+++ b/tests/output_reference.docx
@@ -2,7 +2,7 @@
 <file path=word/document.xml><?xml version="1.0" encoding="utf-8"?>
 <w:document xmlns:w="http://schemas.openxmlformats.org/wordprocessingml/2006/main" xmlns:m="http://schemas.openxmlformats.org/officeDocument/2006/math" xmlns:r="http://schemas.openxmlformats.org/officeDocument/2006/relationships" xmlns:o="urn:schemas-microsoft-com:office:office" xmlns:v="urn:schemas-microsoft-com:vml" xmlns:w10="urn:schemas-microsoft-com:office:word" xmlns:a="http://schemas.openxmlformats.org/drawingml/2006/main" xmlns:pic="http://schemas.openxmlformats.org/drawingml/2006/picture" xmlns:wp="http://schemas.openxmlformats.org/drawingml/2006/wordprocessingDrawing">
   <w:body>
-    <w:bookmarkStart w:id="20" w:name="database-consistency-test"/>
+    <w:bookmarkStart w:id="9" w:name="database-consistency-test"/>
     <w:p>
       <w:pPr>
         <w:pStyle w:val="Heading1"/>
@@ -11,8 +11,8 @@
         <w:t xml:space="preserve">Database Consistency Test</w:t>
       </w:r>
     </w:p>
-    <w:bookmarkEnd w:id="20"/>
-    <w:bookmarkStart w:id="24" w:name="introduction"/>
+    <w:bookmarkEnd w:id="9"/>
+    <w:bookmarkStart w:id="13" w:name="introduction"/>
     <w:p>
       <w:pPr>
         <w:pStyle w:val="Heading1"/>
@@ -42,18 +42,18 @@
           <wp:inline>
             <wp:extent cx="5334000" cy="2841069"/>
             <wp:effectExtent b="0" l="0" r="0" t="0"/>
-            <wp:docPr descr="" title="" id="22" name="Picture"/>
+            <wp:docPr descr="" title="" id="11" name="Picture"/>
             <a:graphic>
               <a:graphicData uri="http://schemas.openxmlformats.org/drawingml/2006/picture">
                 <pic:pic>
                   <pic:nvPicPr>
-                    <pic:cNvPr descr="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" id="23" name="Picture"/>
+                    <pic:cNvPr descr="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" id="12" name="Picture"/>
                     <pic:cNvPicPr>
                       <a:picLocks noChangeArrowheads="1" noChangeAspect="1"/>
                     </pic:cNvPicPr>
                   </pic:nvPicPr>
                   <pic:blipFill>
-                    <a:blip r:embed="rId21"/>
+                    <a:blip r:embed="rId10"/>
                     <a:stretch>
                       <a:fillRect/>
                     </a:stretch>
@@ -92,8 +92,8 @@
         <w:t xml:space="preserve"># Select Beam Material</w:t>
       </w:r>
     </w:p>
-    <w:bookmarkEnd w:id="24"/>
-    <w:bookmarkStart w:id="26" w:name="select-beam-section"/>
+    <w:bookmarkEnd w:id="13"/>
+    <w:bookmarkStart w:id="15" w:name="select-beam-section"/>
     <w:p>
       <w:pPr>
         <w:pStyle w:val="Heading1"/>
@@ -112,7 +112,7 @@
       <w:r>
         <w:t xml:space="preserve"> </w:t>
       </w:r>
-      <w:hyperlink r:id="rId25">
+      <w:hyperlink r:id="rId14">
         <w:r>
           <w:rPr>
             <w:rStyle w:val="Hyperlink"/>
@@ -121,8 +121,8 @@
         </w:r>
       </w:hyperlink>
     </w:p>
-    <w:bookmarkEnd w:id="26"/>
-    <w:bookmarkStart w:id="27" w:name="define-the-other-beam-parameters"/>
+    <w:bookmarkEnd w:id="15"/>
+    <w:bookmarkStart w:id="16" w:name="define-the-other-beam-parameters"/>
     <w:p>
       <w:pPr>
         <w:pStyle w:val="Heading1"/>
@@ -155,8 +155,8 @@
           <m:d>
             <m:dPr>
               <m:begChr m:val="["/>
+              <m:sepChr m:val=""/>
               <m:endChr m:val="]"/>
-              <m:sepChr m:val=""/>
               <m:grow/>
             </m:dPr>
             <m:e>
@@ -195,8 +195,8 @@
           <m:d>
             <m:dPr>
               <m:begChr m:val="["/>
+              <m:sepChr m:val=""/>
               <m:endChr m:val="]"/>
-              <m:sepChr m:val=""/>
               <m:grow/>
             </m:dPr>
             <m:e>
@@ -208,8 +208,8 @@
         </m:oMath>
       </m:oMathPara>
     </w:p>
-    <w:bookmarkEnd w:id="27"/>
-    <w:bookmarkStart w:id="36" w:name="Xfb335a063a29fa7ff8901568d8337a2f539485f"/>
+    <w:bookmarkEnd w:id="16"/>
+    <w:bookmarkStart w:id="25" w:name="Xfb335a063a29fa7ff8901568d8337a2f539485f"/>
     <w:p>
       <w:pPr>
         <w:pStyle w:val="Heading1"/>
@@ -374,8 +374,8 @@
               <m:d>
                 <m:dPr>
                   <m:begChr m:val="["/>
+                  <m:sepChr m:val=""/>
                   <m:endChr m:val="]"/>
-                  <m:sepChr m:val=""/>
                   <m:grow/>
                 </m:dPr>
                 <m:e>
@@ -405,8 +405,8 @@
               <m:d>
                 <m:dPr>
                   <m:begChr m:val="["/>
+                  <m:sepChr m:val=""/>
                   <m:endChr m:val="]"/>
-                  <m:sepChr m:val=""/>
                   <m:grow/>
                 </m:dPr>
                 <m:e>
@@ -587,8 +587,8 @@
               <m:d>
                 <m:dPr>
                   <m:begChr m:val="["/>
+                  <m:sepChr m:val=""/>
                   <m:endChr m:val="]"/>
-                  <m:sepChr m:val=""/>
                   <m:grow/>
                 </m:dPr>
                 <m:e>
@@ -615,8 +615,8 @@
               <m:d>
                 <m:dPr>
                   <m:begChr m:val="["/>
+                  <m:sepChr m:val=""/>
                   <m:endChr m:val="]"/>
-                  <m:sepChr m:val=""/>
                   <m:grow/>
                 </m:dPr>
                 <m:e>
@@ -651,18 +651,18 @@
           <wp:inline>
             <wp:extent cx="5334000" cy="2799305"/>
             <wp:effectExtent b="0" l="0" r="0" t="0"/>
-            <wp:docPr descr="" title="" id="29" name="Picture"/>
+            <wp:docPr descr="" title="" id="18" name="Picture"/>
             <a:graphic>
               <a:graphicData uri="http://schemas.openxmlformats.org/drawingml/2006/picture">
                 <pic:pic>
                   <pic:nvPicPr>
-                    <pic:cNvPr descr="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" id="30" name="Picture"/>
+                    <pic:cNvPr descr="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" id="19" name="Picture"/>
                     <pic:cNvPicPr>
                       <a:picLocks noChangeArrowheads="1" noChangeAspect="1"/>
                     </pic:cNvPicPr>
                   </pic:nvPicPr>
                   <pic:blipFill>
-                    <a:blip r:embed="rId28"/>
+                    <a:blip r:embed="rId17"/>
                     <a:stretch>
                       <a:fillRect/>
                     </a:stretch>
@@ -704,18 +704,18 @@
           <wp:inline>
             <wp:extent cx="5334000" cy="2972009"/>
             <wp:effectExtent b="0" l="0" r="0" t="0"/>
-            <wp:docPr descr="" title="" id="32" name="Picture"/>
+            <wp:docPr descr="" title="" id="21" name="Picture"/>
             <a:graphic>
               <a:graphicData uri="http://schemas.openxmlformats.org/drawingml/2006/picture">
                 <pic:pic>
                   <pic:nvPicPr>
-                    <pic:cNvPr descr="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" id="33" name="Picture"/>
+                    <pic:cNvPr descr="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" id="22" name="Picture"/>
                     <pic:cNvPicPr>
                       <a:picLocks noChangeArrowheads="1" noChangeAspect="1"/>
                     </pic:cNvPicPr>
                   </pic:nvPicPr>
                   <pic:blipFill>
-                    <a:blip r:embed="rId31"/>
+                    <a:blip r:embed="rId20"/>
                     <a:stretch>
                       <a:fillRect/>
                     </a:stretch>
@@ -755,7 +755,7 @@
       <w:r>
         <w:t xml:space="preserve">“</w:t>
       </w:r>
-      <w:hyperlink r:id="rId34">
+      <w:hyperlink r:id="rId23">
         <w:r>
           <w:rPr>
             <w:rStyle w:val="Hyperlink"/>
@@ -842,8 +842,8 @@
           <m:d>
             <m:dPr>
               <m:begChr m:val="("/>
+              <m:sepChr m:val=""/>
               <m:endChr m:val=")"/>
-              <m:sepChr m:val=""/>
               <m:grow/>
             </m:dPr>
             <m:e>
@@ -910,7 +910,7 @@
       <w:r>
         <w:t xml:space="preserve"> </w:t>
       </w:r>
-      <w:hyperlink r:id="rId35">
+      <w:hyperlink r:id="rId24">
         <w:r>
           <w:rPr>
             <w:rStyle w:val="Hyperlink"/>
@@ -919,8 +919,12 @@
         </w:r>
       </w:hyperlink>
     </w:p>
-    <w:bookmarkEnd w:id="36"/>
-    <w:sectPr/>
+    <w:bookmarkEnd w:id="25"/>
+    <w:sectPr>
+      <w:footnotePr>
+        <w:numRestart w:val="eachSect"/>
+      </w:footnotePr>
+    </w:sectPr>
   </w:body>
 </w:document>
 </file>
@@ -1092,8 +1096,6 @@
     </w:pPr>
     <w:rPr>
       <w:rFonts w:asciiTheme="majorHAnsi" w:cstheme="majorBidi" w:eastAsiaTheme="majorEastAsia" w:hAnsiTheme="majorHAnsi"/>
-      <w:spacing w:val="-10"/>
-      <w:kern w:val="28"/>
       <w:sz w:val="56"/>
       <w:szCs w:val="56"/>
     </w:rPr>
@@ -1106,8 +1108,6 @@
     <w:rsid w:val="00A10FD9"/>
     <w:rPr>
       <w:rFonts w:asciiTheme="majorHAnsi" w:cstheme="majorBidi" w:eastAsiaTheme="majorEastAsia" w:hAnsiTheme="majorHAnsi"/>
-      <w:spacing w:val="-10"/>
-      <w:kern w:val="28"/>
       <w:sz w:val="56"/>
       <w:szCs w:val="56"/>
     </w:rPr>
@@ -1148,23 +1148,31 @@
   </w:style>
   <w:style w:customStyle="1" w:styleId="Author" w:type="paragraph">
     <w:name w:val="Author"/>
+    <w:basedOn w:val="Title"/>
     <w:next w:val="BodyText"/>
     <w:qFormat/>
     <w:pPr>
       <w:keepNext/>
       <w:keepLines/>
-      <w:jc w:val="center"/>
-    </w:pPr>
+    </w:pPr>
+    <w:rPr>
+      <w:sz w:val="24"/>
+      <w:szCs w:val="24"/>
+    </w:rPr>
   </w:style>
   <w:style w:styleId="Date" w:type="paragraph">
     <w:name w:val="Date"/>
+    <w:basedOn w:val="Title"/>
     <w:next w:val="BodyText"/>
     <w:qFormat/>
     <w:pPr>
       <w:keepNext/>
       <w:keepLines/>
-      <w:jc w:val="center"/>
-    </w:pPr>
+    </w:pPr>
+    <w:rPr>
+      <w:sz w:val="24"/>
+      <w:szCs w:val="24"/>
+    </w:rPr>
   </w:style>
   <w:style w:customStyle="1" w:styleId="AbstractTitle" w:type="paragraph">
     <w:name w:val="Abstract Title"/>

</xml_diff>

<commit_message>
feat: update lua filter to so visual link indicators in PDF output
</commit_message>
<xml_diff>
--- a/tests/output_reference.docx
+++ b/tests/output_reference.docx
@@ -2555,7 +2555,7 @@
       </w:r>
     </w:p>
     <w:bookmarkEnd w:id="35"/>
-    <w:bookmarkStart w:id="43" w:name="X7d3109fa87318ec704072f1e9d744b2bd34fff7"/>
+    <w:bookmarkStart w:id="42" w:name="X7d3109fa87318ec704072f1e9d744b2bd34fff7"/>
     <w:p>
       <w:pPr>
         <w:pStyle w:val="Heading1"/>
@@ -3759,17 +3759,951 @@
         <w:t xml:space="preserve">Normal text</w:t>
       </w:r>
     </w:p>
+    <w:bookmarkEnd w:id="42"/>
+    <w:bookmarkStart w:id="46" w:name="equation-comments-stress-test"/>
+    <w:p>
+      <w:pPr>
+        <w:pStyle w:val="Heading1"/>
+      </w:pPr>
+      <w:r>
+        <w:t xml:space="preserve">Equation Comments Stress Test</w:t>
+      </w:r>
+    </w:p>
+    <w:p>
+      <w:pPr>
+        <w:pStyle w:val="FirstParagraph"/>
+      </w:pPr>
+      <w:r>
+        <w:t xml:space="preserve">cats and dogs</w:t>
+      </w:r>
+    </w:p>
     <w:p>
       <w:pPr>
         <w:pStyle w:val="BodyText"/>
       </w:pPr>
       <w:r>
+        <w:t xml:space="preserve">cats and dogs</w:t>
+      </w:r>
+    </w:p>
+    <w:p>
+      <w:pPr>
+        <w:pStyle w:val="BodyText"/>
+      </w:pPr>
+      <w:r>
+        <w:t xml:space="preserve">@cats</w:t>
+      </w:r>
+    </w:p>
+    <w:p>
+      <w:pPr>
+        <w:pStyle w:val="BodyText"/>
+      </w:pPr>
+      <w:r>
+        <w:drawing>
+          <wp:inline>
+            <wp:extent cx="508000" cy="279400"/>
+            <wp:effectExtent b="0" l="0" r="0" t="0"/>
+            <wp:docPr descr="" title="" id="44" name="Picture"/>
+            <a:graphic>
+              <a:graphicData uri="http://schemas.openxmlformats.org/drawingml/2006/picture">
+                <pic:pic>
+                  <pic:nvPicPr>
+                    <pic:cNvPr descr="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" id="45" name="Picture"/>
+                    <pic:cNvPicPr>
+                      <a:picLocks noChangeArrowheads="1" noChangeAspect="1"/>
+                    </pic:cNvPicPr>
+                  </pic:nvPicPr>
+                  <pic:blipFill>
+                    <a:blip r:embed="rId43"/>
+                    <a:stretch>
+                      <a:fillRect/>
+                    </a:stretch>
+                  </pic:blipFill>
+                  <pic:spPr bwMode="auto">
+                    <a:xfrm>
+                      <a:off x="0" y="0"/>
+                      <a:ext cx="508000" cy="279400"/>
+                    </a:xfrm>
+                    <a:prstGeom prst="rect">
+                      <a:avLst/>
+                    </a:prstGeom>
+                    <a:noFill/>
+                    <a:ln w="9525">
+                      <a:noFill/>
+                      <a:headEnd/>
+                      <a:tailEnd/>
+                    </a:ln>
+                  </pic:spPr>
+                </pic:pic>
+              </a:graphicData>
+            </a:graphic>
+          </wp:inline>
+        </w:drawing>
+      </w:r>
+    </w:p>
+    <w:p>
+      <w:pPr>
+        <w:pStyle w:val="Compact"/>
+        <w:numPr>
+          <w:ilvl w:val="0"/>
+          <w:numId w:val="1007"/>
+        </w:numPr>
+      </w:pPr>
+      <w:r>
+        <w:t xml:space="preserve">cats</w:t>
+      </w:r>
+    </w:p>
+    <w:p>
+      <w:pPr>
+        <w:pStyle w:val="Compact"/>
+        <w:numPr>
+          <w:ilvl w:val="0"/>
+          <w:numId w:val="1007"/>
+        </w:numPr>
+      </w:pPr>
+      <w:r>
+        <w:t xml:space="preserve">dogs</w:t>
+      </w:r>
+    </w:p>
+    <w:p>
+      <w:pPr>
+        <w:pStyle w:val="Compact"/>
+        <w:numPr>
+          <w:ilvl w:val="1"/>
+          <w:numId w:val="1008"/>
+        </w:numPr>
+      </w:pPr>
+      <w:r>
+        <w:t xml:space="preserve">zebras</w:t>
+      </w:r>
+    </w:p>
+    <w:p>
+      <w:pPr>
+        <w:pStyle w:val="Compact"/>
+        <w:numPr>
+          <w:ilvl w:val="1"/>
+          <w:numId w:val="1008"/>
+        </w:numPr>
+      </w:pPr>
+      <w:r>
+        <w:t xml:space="preserve">giraffes</w:t>
+      </w:r>
+    </w:p>
+    <w:p>
+      <w:pPr>
+        <w:pStyle w:val="Compact"/>
+        <w:numPr>
+          <w:ilvl w:val="2"/>
+          <w:numId w:val="1009"/>
+        </w:numPr>
+      </w:pPr>
+      <w:r>
+        <w:t xml:space="preserve">rats</w:t>
+      </w:r>
+    </w:p>
+    <w:p>
+      <w:pPr>
+        <w:pStyle w:val="Compact"/>
+        <w:numPr>
+          <w:ilvl w:val="2"/>
+          <w:numId w:val="1009"/>
+        </w:numPr>
+      </w:pPr>
+      <w:r>
+        <w:t xml:space="preserve">mice</w:t>
+      </w:r>
+    </w:p>
+    <w:p>
+      <w:pPr>
+        <w:pStyle w:val="Compact"/>
+        <w:numPr>
+          <w:ilvl w:val="2"/>
+          <w:numId w:val="1009"/>
+        </w:numPr>
+      </w:pPr>
+      <w:r>
+        <w:t xml:space="preserve">squirrels</w:t>
+      </w:r>
+    </w:p>
+    <w:p>
+      <w:pPr>
+        <w:pStyle w:val="Compact"/>
+        <w:numPr>
+          <w:ilvl w:val="2"/>
+          <w:numId w:val="1009"/>
+        </w:numPr>
+      </w:pPr>
+      <w:r>
+        <w:t xml:space="preserve">rabbits</w:t>
+      </w:r>
+    </w:p>
+    <w:p>
+      <w:pPr>
+        <w:pStyle w:val="Compact"/>
+        <w:numPr>
+          <w:ilvl w:val="3"/>
+          <w:numId w:val="1010"/>
+        </w:numPr>
+      </w:pPr>
+      <w:r>
+        <w:t xml:space="preserve">bass</w:t>
+      </w:r>
+    </w:p>
+    <w:p>
+      <w:pPr>
+        <w:pStyle w:val="Compact"/>
+        <w:numPr>
+          <w:ilvl w:val="3"/>
+          <w:numId w:val="1010"/>
+        </w:numPr>
+      </w:pPr>
+      <w:r>
+        <w:t xml:space="preserve">walleye</w:t>
+      </w:r>
+    </w:p>
+    <w:p>
+      <w:pPr>
+        <w:pStyle w:val="Compact"/>
+        <w:numPr>
+          <w:ilvl w:val="0"/>
+          <w:numId w:val="1011"/>
+        </w:numPr>
+      </w:pPr>
+      <w:r>
+        <w:t xml:space="preserve">eagles</w:t>
+      </w:r>
+    </w:p>
+    <w:p>
+      <w:pPr>
+        <w:pStyle w:val="Compact"/>
+        <w:numPr>
+          <w:ilvl w:val="0"/>
+          <w:numId w:val="1011"/>
+        </w:numPr>
+      </w:pPr>
+      <w:r>
+        <w:t xml:space="preserve">sparrows</w:t>
+      </w:r>
+    </w:p>
+    <w:p>
+      <w:pPr>
+        <w:pStyle w:val="Compact"/>
+        <w:numPr>
+          <w:ilvl w:val="1"/>
+          <w:numId w:val="1012"/>
+        </w:numPr>
+      </w:pPr>
+      <w:r>
+        <w:t xml:space="preserve">pigeons</w:t>
+      </w:r>
+    </w:p>
+    <w:p>
+      <w:pPr>
+        <w:pStyle w:val="Compact"/>
+        <w:numPr>
+          <w:ilvl w:val="1"/>
+          <w:numId w:val="1012"/>
+        </w:numPr>
+      </w:pPr>
+      <w:r>
+        <w:t xml:space="preserve">geese</w:t>
+      </w:r>
+    </w:p>
+    <w:p>
+      <w:pPr>
+        <w:pStyle w:val="FirstParagraph"/>
+      </w:pPr>
+      <m:oMath>
+        <m:r>
+          <m:t>1</m:t>
+        </m:r>
+        <m:r>
+          <m:rPr>
+            <m:nor/>
+            <m:sty m:val="p"/>
+          </m:rPr>
+          <m:t>cats{} in the house</m:t>
+        </m:r>
+        <m:r>
+          <m:rPr>
+            <m:sty m:val="p"/>
+          </m:rPr>
+          <m:t>=</m:t>
+        </m:r>
+        <m:r>
+          <m:t>1</m:t>
+        </m:r>
+      </m:oMath>
+      <w:r>
+        <w:t xml:space="preserve"> </w:t>
+      </w:r>
+    </w:p>
+    <w:p>
+      <w:pPr>
+        <w:pStyle w:val="BodyText"/>
+      </w:pPr>
+      <m:oMath>
+        <m:r>
+          <m:t>1</m:t>
+        </m:r>
+        <m:r>
+          <m:rPr>
+            <m:nor/>
+            <m:sty m:val="p"/>
+          </m:rPr>
+          <m:t>cats{ in the house</m:t>
+        </m:r>
+        <m:r>
+          <m:rPr>
+            <m:sty m:val="p"/>
+          </m:rPr>
+          <m:t>=</m:t>
+        </m:r>
+        <m:r>
+          <m:t>1</m:t>
+        </m:r>
+      </m:oMath>
+      <w:r>
+        <w:t xml:space="preserve"> </w:t>
+      </w:r>
+    </w:p>
+    <w:p>
+      <w:pPr>
+        <w:pStyle w:val="BodyText"/>
+      </w:pPr>
+      <m:oMath>
+        <m:r>
+          <m:t>1</m:t>
+        </m:r>
+        <m:r>
+          <m:rPr>
+            <m:nor/>
+            <m:sty m:val="p"/>
+          </m:rPr>
+          <m:t>cats} in the house</m:t>
+        </m:r>
+        <m:r>
+          <m:rPr>
+            <m:sty m:val="p"/>
+          </m:rPr>
+          <m:t>=</m:t>
+        </m:r>
+        <m:r>
+          <m:t>1</m:t>
+        </m:r>
+      </m:oMath>
+      <w:r>
+        <w:t xml:space="preserve"> </w:t>
+      </w:r>
+    </w:p>
+    <w:p>
+      <w:pPr>
+        <w:pStyle w:val="BodyText"/>
+      </w:pPr>
+      <m:oMath>
+        <m:r>
+          <m:t>2</m:t>
+        </m:r>
+        <m:r>
+          <m:rPr>
+            <m:nor/>
+            <m:sty m:val="p"/>
+          </m:rPr>
+          <m:t>dogs[] in the house</m:t>
+        </m:r>
+        <m:r>
+          <m:rPr>
+            <m:sty m:val="p"/>
+          </m:rPr>
+          <m:t>=</m:t>
+        </m:r>
+        <m:r>
+          <m:t>2</m:t>
+        </m:r>
+      </m:oMath>
+      <w:r>
+        <w:t xml:space="preserve"> </w:t>
+      </w:r>
+    </w:p>
+    <w:p>
+      <w:pPr>
+        <w:pStyle w:val="BodyText"/>
+      </w:pPr>
+      <m:oMath>
+        <m:r>
+          <m:t>2</m:t>
+        </m:r>
+        <m:r>
+          <m:rPr>
+            <m:nor/>
+            <m:sty m:val="p"/>
+          </m:rPr>
+          <m:t>dogs[ in the house</m:t>
+        </m:r>
+        <m:r>
+          <m:rPr>
+            <m:sty m:val="p"/>
+          </m:rPr>
+          <m:t>=</m:t>
+        </m:r>
+        <m:r>
+          <m:t>2</m:t>
+        </m:r>
+      </m:oMath>
+      <w:r>
+        <w:t xml:space="preserve"> </w:t>
+      </w:r>
+    </w:p>
+    <w:p>
+      <w:pPr>
+        <w:pStyle w:val="BodyText"/>
+      </w:pPr>
+      <m:oMath>
+        <m:r>
+          <m:t>2</m:t>
+        </m:r>
+        <m:r>
+          <m:rPr>
+            <m:nor/>
+            <m:sty m:val="p"/>
+          </m:rPr>
+          <m:t>dogs] in the house</m:t>
+        </m:r>
+        <m:r>
+          <m:rPr>
+            <m:sty m:val="p"/>
+          </m:rPr>
+          <m:t>=</m:t>
+        </m:r>
+        <m:r>
+          <m:t>2</m:t>
+        </m:r>
+      </m:oMath>
+      <w:r>
+        <w:t xml:space="preserve"> </w:t>
+      </w:r>
+    </w:p>
+    <w:p>
+      <w:pPr>
+        <w:pStyle w:val="BodyText"/>
+      </w:pPr>
+      <m:oMath>
+        <m:r>
+          <m:t>3</m:t>
+        </m:r>
+        <m:r>
+          <m:rPr>
+            <m:nor/>
+            <m:sty m:val="p"/>
+          </m:rPr>
+          <m:t>zebras in the house</m:t>
+        </m:r>
+        <m:r>
+          <m:rPr>
+            <m:sty m:val="p"/>
+          </m:rPr>
+          <m:t>=</m:t>
+        </m:r>
+        <m:r>
+          <m:t>3</m:t>
+        </m:r>
+      </m:oMath>
+      <w:r>
+        <w:t xml:space="preserve"> </w:t>
+      </w:r>
+    </w:p>
+    <w:p>
+      <w:pPr>
+        <w:pStyle w:val="BodyText"/>
+      </w:pPr>
+      <m:oMath>
+        <m:r>
+          <m:t>4</m:t>
+        </m:r>
+        <m:r>
+          <m:rPr>
+            <m:nor/>
+            <m:sty m:val="p"/>
+          </m:rPr>
+          <m:t>giraffes! in the house</m:t>
+        </m:r>
+        <m:r>
+          <m:rPr>
+            <m:sty m:val="p"/>
+          </m:rPr>
+          <m:t>=</m:t>
+        </m:r>
+        <m:r>
+          <m:t>4</m:t>
+        </m:r>
+      </m:oMath>
+      <w:r>
+        <w:t xml:space="preserve"> </w:t>
+      </w:r>
+    </w:p>
+    <w:p>
+      <w:pPr>
+        <w:pStyle w:val="BodyText"/>
+      </w:pPr>
+      <m:oMath>
+        <m:r>
+          <m:t>5</m:t>
+        </m:r>
+        <m:r>
+          <m:rPr>
+            <m:nor/>
+            <m:sty m:val="p"/>
+          </m:rPr>
+          <m:t>mice% in the house</m:t>
+        </m:r>
+        <m:r>
+          <m:rPr>
+            <m:sty m:val="p"/>
+          </m:rPr>
+          <m:t>=</m:t>
+        </m:r>
+        <m:r>
+          <m:t>5</m:t>
+        </m:r>
+      </m:oMath>
+      <w:r>
+        <w:t xml:space="preserve"> </w:t>
+      </w:r>
+    </w:p>
+    <w:p>
+      <w:pPr>
+        <w:pStyle w:val="BodyText"/>
+      </w:pPr>
+      <m:oMath>
+        <m:r>
+          <m:t>6</m:t>
+        </m:r>
+        <m:r>
+          <m:rPr>
+            <m:nor/>
+            <m:sty m:val="p"/>
+          </m:rPr>
+          <m:t>squirrels&amp; in the house</m:t>
+        </m:r>
+        <m:r>
+          <m:rPr>
+            <m:sty m:val="p"/>
+          </m:rPr>
+          <m:t>=</m:t>
+        </m:r>
+        <m:r>
+          <m:t>6</m:t>
+        </m:r>
+      </m:oMath>
+      <w:r>
+        <w:t xml:space="preserve"> </w:t>
+      </w:r>
+    </w:p>
+    <w:p>
+      <w:pPr>
+        <w:pStyle w:val="BodyText"/>
+      </w:pPr>
+      <m:oMath>
+        <m:r>
+          <m:t>7</m:t>
+        </m:r>
+        <m:r>
+          <m:rPr>
+            <m:nor/>
+            <m:sty m:val="p"/>
+          </m:rPr>
+          <m:t>rats^ in the house</m:t>
+        </m:r>
+        <m:r>
+          <m:rPr>
+            <m:sty m:val="p"/>
+          </m:rPr>
+          <m:t>=</m:t>
+        </m:r>
+        <m:r>
+          <m:t>7</m:t>
+        </m:r>
+      </m:oMath>
+      <w:r>
+        <w:t xml:space="preserve"> </w:t>
+      </w:r>
+    </w:p>
+    <w:p>
+      <w:pPr>
+        <w:pStyle w:val="BodyText"/>
+      </w:pPr>
+      <m:oMath>
+        <m:r>
+          <m:t>8</m:t>
+        </m:r>
+        <m:r>
+          <m:rPr>
+            <m:nor/>
+            <m:sty m:val="p"/>
+          </m:rPr>
+          <m:t>horses# in the house</m:t>
+        </m:r>
+        <m:r>
+          <m:rPr>
+            <m:sty m:val="p"/>
+          </m:rPr>
+          <m:t>=</m:t>
+        </m:r>
+        <m:r>
+          <m:t>8</m:t>
+        </m:r>
+      </m:oMath>
+      <w:r>
+        <w:t xml:space="preserve"> </w:t>
+      </w:r>
+    </w:p>
+    <w:p>
+      <w:pPr>
+        <w:pStyle w:val="BodyText"/>
+      </w:pPr>
+      <m:oMath>
+        <m:r>
+          <m:t>9</m:t>
+        </m:r>
+        <m:r>
+          <m:rPr>
+            <m:nor/>
+            <m:sty m:val="p"/>
+          </m:rPr>
+          <m:t>cows @ in the house</m:t>
+        </m:r>
+        <m:r>
+          <m:rPr>
+            <m:sty m:val="p"/>
+          </m:rPr>
+          <m:t>=</m:t>
+        </m:r>
+        <m:r>
+          <m:t>9</m:t>
+        </m:r>
+      </m:oMath>
+      <w:r>
+        <w:t xml:space="preserve"> </w:t>
+      </w:r>
+    </w:p>
+    <w:p>
+      <w:pPr>
+        <w:pStyle w:val="BodyText"/>
+      </w:pPr>
+      <m:oMath>
+        <m:r>
+          <m:t>10</m:t>
+        </m:r>
+        <m:r>
+          <m:rPr>
+            <m:nor/>
+            <m:sty m:val="p"/>
+          </m:rPr>
+          <m:t>pigs $ in the house</m:t>
+        </m:r>
+        <m:r>
+          <m:t> </m:t>
+        </m:r>
+        <m:r>
+          <m:rPr>
+            <m:sty m:val="p"/>
+          </m:rPr>
+          <m:t>=</m:t>
+        </m:r>
+        <m:r>
+          <m:t>10</m:t>
+        </m:r>
+      </m:oMath>
+      <w:r>
+        <w:t xml:space="preserve"> </w:t>
+      </w:r>
+    </w:p>
+    <w:p>
+      <w:pPr>
+        <w:pStyle w:val="BodyText"/>
+      </w:pPr>
+      <m:oMath>
+        <m:r>
+          <m:t>11</m:t>
+        </m:r>
+        <m:r>
+          <m:rPr>
+            <m:nor/>
+            <m:sty m:val="p"/>
+          </m:rPr>
+          <m:t>goats * in the house</m:t>
+        </m:r>
+        <m:r>
+          <m:rPr>
+            <m:sty m:val="p"/>
+          </m:rPr>
+          <m:t>=</m:t>
+        </m:r>
+        <m:r>
+          <m:t>11</m:t>
+        </m:r>
+      </m:oMath>
+      <w:r>
+        <w:t xml:space="preserve"> </w:t>
+      </w:r>
+    </w:p>
+    <w:p>
+      <w:pPr>
+        <w:pStyle w:val="BodyText"/>
+      </w:pPr>
+      <m:oMath>
+        <m:r>
+          <m:t>12</m:t>
+        </m:r>
+        <m:r>
+          <m:rPr>
+            <m:nor/>
+            <m:sty m:val="p"/>
+          </m:rPr>
+          <m:t>rabbits() in the house</m:t>
+        </m:r>
+        <m:r>
+          <m:rPr>
+            <m:sty m:val="p"/>
+          </m:rPr>
+          <m:t>=</m:t>
+        </m:r>
+        <m:r>
+          <m:t>12</m:t>
+        </m:r>
+      </m:oMath>
+      <w:r>
+        <w:t xml:space="preserve"> </w:t>
+      </w:r>
+    </w:p>
+    <w:p>
+      <w:pPr>
+        <w:pStyle w:val="BodyText"/>
+      </w:pPr>
+      <m:oMath>
+        <m:r>
+          <m:t>12</m:t>
+        </m:r>
+        <m:r>
+          <m:rPr>
+            <m:nor/>
+            <m:sty m:val="p"/>
+          </m:rPr>
+          <m:t>rabbits) in the house</m:t>
+        </m:r>
+        <m:r>
+          <m:rPr>
+            <m:sty m:val="p"/>
+          </m:rPr>
+          <m:t>=</m:t>
+        </m:r>
+        <m:r>
+          <m:t>12</m:t>
+        </m:r>
+      </m:oMath>
+      <w:r>
+        <w:t xml:space="preserve"> </w:t>
+      </w:r>
+    </w:p>
+    <w:p>
+      <w:pPr>
+        <w:pStyle w:val="BodyText"/>
+      </w:pPr>
+      <m:oMath>
+        <m:r>
+          <m:t>12</m:t>
+        </m:r>
+        <m:r>
+          <m:rPr>
+            <m:nor/>
+            <m:sty m:val="p"/>
+          </m:rPr>
+          <m:t>rabbits( in the house</m:t>
+        </m:r>
+        <m:r>
+          <m:rPr>
+            <m:sty m:val="p"/>
+          </m:rPr>
+          <m:t>=</m:t>
+        </m:r>
+        <m:r>
+          <m:t>12</m:t>
+        </m:r>
+      </m:oMath>
+      <w:r>
+        <w:t xml:space="preserve"> </w:t>
+      </w:r>
+    </w:p>
+    <w:p>
+      <w:pPr>
+        <w:pStyle w:val="BodyText"/>
+      </w:pPr>
+      <m:oMath>
+        <m:r>
+          <m:t>13</m:t>
+        </m:r>
+        <m:r>
+          <m:rPr>
+            <m:nor/>
+            <m:sty m:val="p"/>
+          </m:rPr>
+          <m:t>sparrow -+/&lt;&gt;.,’;:~?&lt;&gt;</m:t>
+        </m:r>
+        <m:r>
+          <m:rPr>
+            <m:sty m:val="p"/>
+          </m:rPr>
+          <m:t>=</m:t>
+        </m:r>
+        <m:r>
+          <m:t>13</m:t>
+        </m:r>
+      </m:oMath>
+      <w:r>
+        <w:t xml:space="preserve"> </w:t>
+      </w:r>
+    </w:p>
+    <w:p>
+      <w:pPr>
+        <w:pStyle w:val="BodyText"/>
+      </w:pPr>
+      <m:oMath>
+        <m:r>
+          <m:t>14</m:t>
+        </m:r>
+        <m:r>
+          <m:rPr>
+            <m:nor/>
+            <m:sty m:val="p"/>
+          </m:rPr>
+          <m:t>fox _ in the house</m:t>
+        </m:r>
+        <m:r>
+          <m:rPr>
+            <m:sty m:val="p"/>
+          </m:rPr>
+          <m:t>=</m:t>
+        </m:r>
+        <m:r>
+          <m:t>14</m:t>
+        </m:r>
+      </m:oMath>
+      <w:r>
+        <w:t xml:space="preserve"> </w:t>
+      </w:r>
+    </w:p>
+    <w:p>
+      <w:pPr>
+        <w:pStyle w:val="BodyText"/>
+      </w:pPr>
+      <m:oMath>
+        <m:r>
+          <m:t>15</m:t>
+        </m:r>
+        <m:r>
+          <m:rPr>
+            <m:nor/>
+            <m:sty m:val="p"/>
+          </m:rPr>
+          <m:t>bear\ in the house</m:t>
+        </m:r>
+        <m:r>
+          <m:rPr>
+            <m:sty m:val="p"/>
+          </m:rPr>
+          <m:t>=</m:t>
+        </m:r>
+        <m:r>
+          <m:t>15</m:t>
+        </m:r>
+      </m:oMath>
+      <w:r>
+        <w:t xml:space="preserve"> </w:t>
+      </w:r>
+    </w:p>
+    <w:bookmarkEnd w:id="46"/>
+    <w:bookmarkStart w:id="49" w:name="link-colors"/>
+    <w:p>
+      <w:pPr>
+        <w:pStyle w:val="Heading1"/>
+      </w:pPr>
+      <w:r>
+        <w:t xml:space="preserve">Link Colors</w:t>
+      </w:r>
+    </w:p>
+    <w:p>
+      <w:pPr>
+        <w:pStyle w:val="FirstParagraph"/>
+      </w:pPr>
+      <w:r>
+        <w:t xml:space="preserve">Link test</w:t>
+      </w:r>
+      <w:r>
+        <w:t xml:space="preserve"> </w:t>
+      </w:r>
+      <w:hyperlink r:id="rId47">
+        <w:r>
+          <w:rPr>
+            <w:rStyle w:val="Hyperlink"/>
+          </w:rPr>
+          <w:t xml:space="preserve">www.cnn.com</w:t>
+        </w:r>
+      </w:hyperlink>
+    </w:p>
+    <w:p>
+      <w:pPr>
+        <w:pStyle w:val="BodyText"/>
+      </w:pPr>
+      <w:r>
+        <w:t xml:space="preserve">Link test</w:t>
+      </w:r>
+      <w:r>
+        <w:t xml:space="preserve"> </w:t>
+      </w:r>
+      <w:hyperlink r:id="rId47">
+        <w:r>
+          <w:rPr>
+            <w:rStyle w:val="ColorF06666BgFFFF66"/>
+          </w:rPr>
+          <w:t xml:space="preserve">www.cnn.com</w:t>
+        </w:r>
+      </w:hyperlink>
+    </w:p>
+    <w:p>
+      <w:pPr>
+        <w:pStyle w:val="BodyText"/>
+      </w:pPr>
+      <w:r>
+        <w:rPr>
+          <w:rStyle w:val="Color66B966BgFFFFCC"/>
+        </w:rPr>
+        <w:t xml:space="preserve">Link test</w:t>
+      </w:r>
+      <w:r>
+        <w:rPr>
+          <w:rStyle w:val="Color66B966BgFFFFCC"/>
+        </w:rPr>
+        <w:t xml:space="preserve"> </w:t>
+      </w:r>
+      <w:hyperlink r:id="rId47">
+        <w:r>
+          <w:rPr>
+            <w:rStyle w:val="Hyperlink"/>
+          </w:rPr>
+          <w:t xml:space="preserve">www.cnn.com</w:t>
+        </w:r>
+      </w:hyperlink>
+    </w:p>
+    <w:p>
+      <w:pPr>
+        <w:pStyle w:val="BodyText"/>
+      </w:pPr>
+      <w:r>
         <w:t xml:space="preserve">Created with</w:t>
       </w:r>
       <w:r>
         <w:t xml:space="preserve"> </w:t>
       </w:r>
-      <w:hyperlink r:id="rId42">
+      <w:hyperlink r:id="rId48">
         <w:r>
           <w:rPr>
             <w:rStyle w:val="Hyperlink"/>
@@ -3778,7 +4712,7 @@
         </w:r>
       </w:hyperlink>
     </w:p>
-    <w:bookmarkEnd w:id="43"/>
+    <w:bookmarkEnd w:id="49"/>
     <w:sectPr>
       <w:footnotePr>
         <w:numRestart w:val="eachSect"/>
@@ -4155,6 +5089,91 @@
     <w:lvl w:ilvl="8">
       <w:start w:val="1"/>
       <w:numFmt w:val="lowerLetter"/>
+      <w:lvlText w:val="%9."/>
+      <w:lvlJc w:val="left"/>
+      <w:pPr>
+        <w:ind w:left="6480" w:hanging="360"/>
+      </w:pPr>
+    </w:lvl>
+  </w:abstractNum>
+  <w:abstractNum w:abstractNumId="99511">
+    <w:nsid w:val="00A99511"/>
+    <w:multiLevelType w:val="multilevel"/>
+    <w:lvl w:ilvl="0">
+      <w:start w:val="1"/>
+      <w:numFmt w:val="lowerRoman"/>
+      <w:lvlText w:val="%1."/>
+      <w:lvlJc w:val="left"/>
+      <w:pPr>
+        <w:ind w:left="720" w:hanging="360"/>
+      </w:pPr>
+    </w:lvl>
+    <w:lvl w:ilvl="1">
+      <w:start w:val="1"/>
+      <w:numFmt w:val="lowerRoman"/>
+      <w:lvlText w:val="%2."/>
+      <w:lvlJc w:val="left"/>
+      <w:pPr>
+        <w:ind w:left="1440" w:hanging="360"/>
+      </w:pPr>
+    </w:lvl>
+    <w:lvl w:ilvl="2">
+      <w:start w:val="1"/>
+      <w:numFmt w:val="lowerRoman"/>
+      <w:lvlText w:val="%3."/>
+      <w:lvlJc w:val="left"/>
+      <w:pPr>
+        <w:ind w:left="2160" w:hanging="360"/>
+      </w:pPr>
+    </w:lvl>
+    <w:lvl w:ilvl="3">
+      <w:start w:val="1"/>
+      <w:numFmt w:val="lowerRoman"/>
+      <w:lvlText w:val="%4."/>
+      <w:lvlJc w:val="left"/>
+      <w:pPr>
+        <w:ind w:left="2880" w:hanging="360"/>
+      </w:pPr>
+    </w:lvl>
+    <w:lvl w:ilvl="4">
+      <w:start w:val="1"/>
+      <w:numFmt w:val="lowerRoman"/>
+      <w:lvlText w:val="%5."/>
+      <w:lvlJc w:val="left"/>
+      <w:pPr>
+        <w:ind w:left="3600" w:hanging="360"/>
+      </w:pPr>
+    </w:lvl>
+    <w:lvl w:ilvl="5">
+      <w:start w:val="1"/>
+      <w:numFmt w:val="lowerRoman"/>
+      <w:lvlText w:val="%6."/>
+      <w:lvlJc w:val="left"/>
+      <w:pPr>
+        <w:ind w:left="4320" w:hanging="360"/>
+      </w:pPr>
+    </w:lvl>
+    <w:lvl w:ilvl="6">
+      <w:start w:val="1"/>
+      <w:numFmt w:val="lowerRoman"/>
+      <w:lvlText w:val="%7."/>
+      <w:lvlJc w:val="left"/>
+      <w:pPr>
+        <w:ind w:left="5040" w:hanging="360"/>
+      </w:pPr>
+    </w:lvl>
+    <w:lvl w:ilvl="7">
+      <w:start w:val="1"/>
+      <w:numFmt w:val="lowerRoman"/>
+      <w:lvlText w:val="%8."/>
+      <w:lvlJc w:val="left"/>
+      <w:pPr>
+        <w:ind w:left="5760" w:hanging="360"/>
+      </w:pPr>
+    </w:lvl>
+    <w:lvl w:ilvl="8">
+      <w:start w:val="1"/>
+      <w:numFmt w:val="lowerRoman"/>
       <w:lvlText w:val="%9."/>
       <w:lvlJc w:val="left"/>
       <w:pPr>
@@ -4290,6 +5309,132 @@
     <w:lvlOverride w:ilvl="8">
       <w:startOverride w:val="1"/>
     </w:lvlOverride>
+  </w:num>
+  <w:num w:numId="1007">
+    <w:abstractNumId w:val="99411"/>
+    <w:lvlOverride w:ilvl="0">
+      <w:startOverride w:val="1"/>
+    </w:lvlOverride>
+    <w:lvlOverride w:ilvl="1">
+      <w:startOverride w:val="1"/>
+    </w:lvlOverride>
+    <w:lvlOverride w:ilvl="2">
+      <w:startOverride w:val="1"/>
+    </w:lvlOverride>
+    <w:lvlOverride w:ilvl="3">
+      <w:startOverride w:val="1"/>
+    </w:lvlOverride>
+    <w:lvlOverride w:ilvl="4">
+      <w:startOverride w:val="1"/>
+    </w:lvlOverride>
+    <w:lvlOverride w:ilvl="5">
+      <w:startOverride w:val="1"/>
+    </w:lvlOverride>
+    <w:lvlOverride w:ilvl="6">
+      <w:startOverride w:val="1"/>
+    </w:lvlOverride>
+    <w:lvlOverride w:ilvl="7">
+      <w:startOverride w:val="1"/>
+    </w:lvlOverride>
+    <w:lvlOverride w:ilvl="8">
+      <w:startOverride w:val="1"/>
+    </w:lvlOverride>
+  </w:num>
+  <w:num w:numId="1008">
+    <w:abstractNumId w:val="99711"/>
+    <w:lvlOverride w:ilvl="0">
+      <w:startOverride w:val="1"/>
+    </w:lvlOverride>
+    <w:lvlOverride w:ilvl="1">
+      <w:startOverride w:val="1"/>
+    </w:lvlOverride>
+    <w:lvlOverride w:ilvl="2">
+      <w:startOverride w:val="1"/>
+    </w:lvlOverride>
+    <w:lvlOverride w:ilvl="3">
+      <w:startOverride w:val="1"/>
+    </w:lvlOverride>
+    <w:lvlOverride w:ilvl="4">
+      <w:startOverride w:val="1"/>
+    </w:lvlOverride>
+    <w:lvlOverride w:ilvl="5">
+      <w:startOverride w:val="1"/>
+    </w:lvlOverride>
+    <w:lvlOverride w:ilvl="6">
+      <w:startOverride w:val="1"/>
+    </w:lvlOverride>
+    <w:lvlOverride w:ilvl="7">
+      <w:startOverride w:val="1"/>
+    </w:lvlOverride>
+    <w:lvlOverride w:ilvl="8">
+      <w:startOverride w:val="1"/>
+    </w:lvlOverride>
+  </w:num>
+  <w:num w:numId="1009">
+    <w:abstractNumId w:val="99511"/>
+    <w:lvlOverride w:ilvl="0">
+      <w:startOverride w:val="1"/>
+    </w:lvlOverride>
+    <w:lvlOverride w:ilvl="1">
+      <w:startOverride w:val="1"/>
+    </w:lvlOverride>
+    <w:lvlOverride w:ilvl="2">
+      <w:startOverride w:val="1"/>
+    </w:lvlOverride>
+    <w:lvlOverride w:ilvl="3">
+      <w:startOverride w:val="1"/>
+    </w:lvlOverride>
+    <w:lvlOverride w:ilvl="4">
+      <w:startOverride w:val="1"/>
+    </w:lvlOverride>
+    <w:lvlOverride w:ilvl="5">
+      <w:startOverride w:val="1"/>
+    </w:lvlOverride>
+    <w:lvlOverride w:ilvl="6">
+      <w:startOverride w:val="1"/>
+    </w:lvlOverride>
+    <w:lvlOverride w:ilvl="7">
+      <w:startOverride w:val="1"/>
+    </w:lvlOverride>
+    <w:lvlOverride w:ilvl="8">
+      <w:startOverride w:val="1"/>
+    </w:lvlOverride>
+  </w:num>
+  <w:num w:numId="1010">
+    <w:abstractNumId w:val="99411"/>
+    <w:lvlOverride w:ilvl="0">
+      <w:startOverride w:val="1"/>
+    </w:lvlOverride>
+    <w:lvlOverride w:ilvl="1">
+      <w:startOverride w:val="1"/>
+    </w:lvlOverride>
+    <w:lvlOverride w:ilvl="2">
+      <w:startOverride w:val="1"/>
+    </w:lvlOverride>
+    <w:lvlOverride w:ilvl="3">
+      <w:startOverride w:val="1"/>
+    </w:lvlOverride>
+    <w:lvlOverride w:ilvl="4">
+      <w:startOverride w:val="1"/>
+    </w:lvlOverride>
+    <w:lvlOverride w:ilvl="5">
+      <w:startOverride w:val="1"/>
+    </w:lvlOverride>
+    <w:lvlOverride w:ilvl="6">
+      <w:startOverride w:val="1"/>
+    </w:lvlOverride>
+    <w:lvlOverride w:ilvl="7">
+      <w:startOverride w:val="1"/>
+    </w:lvlOverride>
+    <w:lvlOverride w:ilvl="8">
+      <w:startOverride w:val="1"/>
+    </w:lvlOverride>
+  </w:num>
+  <w:num w:numId="1011">
+    <w:abstractNumId w:val="991"/>
+  </w:num>
+  <w:num w:numId="1012">
+    <w:abstractNumId w:val="991"/>
   </w:num>
 </w:numbering>
 </file>

</xml_diff>